<commit_message>
Standardize toolkit themes and setup; fix findings from full QC
</commit_message>
<xml_diff>
--- a/biostat_pipeline/EarlyPhase_Biostat_Pipeline.docx
+++ b/biostat_pipeline/EarlyPhase_Biostat_Pipeline.docx
@@ -47,9 +47,9 @@
           <w:iCs/>
           <w:color w:val="555F77"/>
         </w:rPr>
-        <w:t xml:space="preserve"> This register maps the deliverables of a Phase 1 clinical pharmacology study and how each would be produced and checked. It is not a list of deliverables the author produced (the </w:t>
+        <w:t xml:space="preserve"> This register maps the deliverables of a Phase 1 clinical pharmacology study and how each would be produced and checked. It is a reusable planning reference for consultants and employees, not a list of completed client deliverables. The </w:t>
       </w:r>
-      <w:hyperlink w:history="1" r:id="rIdjut5ybltjj6vxpcmeu65c">
+      <w:hyperlink w:history="1" r:id="rIdg8j-kocngxdcke3-2jr-4">
         <w:r>
           <w:rPr>
             <w:rStyle w:val="Hyperlink"/>
@@ -57,7 +57,7 @@
             <w:iCs/>
             <w:color w:val="555F77"/>
           </w:rPr>
-          <w:t xml:space="preserve">home page</w:t>
+          <w:t xml:space="preserve">toolkit home page</w:t>
         </w:r>
       </w:hyperlink>
       <w:r>
@@ -66,7 +66,7 @@
           <w:iCs/>
           <w:color w:val="555F77"/>
         </w:rPr>
-        <w:t xml:space="preserve"> labels what he led or supported). A short appendix sets out where AI tools could assist under controls; it is a proposal, not an adopted policy.</w:t>
+        <w:t xml:space="preserve"> links to runnable examples. A short appendix sets out where AI tools could assist under controls; it is a proposal, not an adopted policy.</w:t>
       </w:r>
     </w:p>
     <w:p>
@@ -130,7 +130,7 @@
           <w:iCs/>
           <w:color w:val="555F77"/>
         </w:rPr>
-        <w:t xml:space="preserve">. Standards as of October 2026: CDISC SDTMIG v3.4, ADaMIG v1.3, and Define-XML v2.1 (all FDA-required); ICH E3, E6(R3), E9(R1), and M11; systems designed to meet 21 CFR Part 11; ISPE GAMP 5.</w:t>
+        <w:t xml:space="preserve">. Reference versions used here: CDISC SDTMIG v3.4, ADaMIG v1.3, and Define-XML v2.1; ICH E3, E6(R3), E9(R1), and M11; 21 CFR Part 11; ISPE GAMP 5. Confirm applicable requirements, supported versions and effective dates for the intended study and submission.</w:t>
       </w:r>
     </w:p>
     <w:p>
@@ -29271,6 +29271,10 @@
 </w:document>
 </file>
 
+<file path=word/comments.xml><?xml version="1.0" encoding="utf-8"?>
+<w:comments xmlns:cx="http://schemas.microsoft.com/office/drawing/2014/chartex" xmlns:cx1="http://schemas.microsoft.com/office/drawing/2015/9/8/chartex" xmlns:cx2="http://schemas.microsoft.com/office/drawing/2015/10/21/chartex" xmlns:cx3="http://schemas.microsoft.com/office/drawing/2016/5/9/chartex" xmlns:cx4="http://schemas.microsoft.com/office/drawing/2016/5/10/chartex" xmlns:cx5="http://schemas.microsoft.com/office/drawing/2016/5/11/chartex" xmlns:cx6="http://schemas.microsoft.com/office/drawing/2016/5/12/chartex" xmlns:cx7="http://schemas.microsoft.com/office/drawing/2016/5/13/chartex" xmlns:cx8="http://schemas.microsoft.com/office/drawing/2016/5/14/chartex" xmlns:mc="http://schemas.openxmlformats.org/markup-compatibility/2006" xmlns:aink="http://schemas.microsoft.com/office/drawing/2016/ink" xmlns:am3d="http://schemas.microsoft.com/office/drawing/2017/model3d" xmlns:o="urn:schemas-microsoft-com:office:office" xmlns:r="http://schemas.openxmlformats.org/officeDocument/2006/relationships" xmlns:m="http://schemas.openxmlformats.org/officeDocument/2006/math" xmlns:v="urn:schemas-microsoft-com:vml" xmlns:wp14="http://schemas.microsoft.com/office/word/2010/wordprocessingDrawing" xmlns:wp="http://schemas.openxmlformats.org/drawingml/2006/wordprocessingDrawing" xmlns:w10="urn:schemas-microsoft-com:office:word" xmlns:w="http://schemas.openxmlformats.org/wordprocessingml/2006/main" xmlns:w14="http://schemas.microsoft.com/office/word/2010/wordml" xmlns:w15="http://schemas.microsoft.com/office/word/2012/wordml" xmlns:w16cex="http://schemas.microsoft.com/office/word/2018/wordml/cex" xmlns:w16cid="http://schemas.microsoft.com/office/word/2016/wordml/cid" xmlns:w16="http://schemas.microsoft.com/office/word/2018/wordml" xmlns:w16sdtdh="http://schemas.microsoft.com/office/word/2020/wordml/sdtdatahash" xmlns:w16se="http://schemas.microsoft.com/office/word/2015/wordml/symex" xmlns:wpg="http://schemas.microsoft.com/office/word/2010/wordprocessingGroup" xmlns:wpi="http://schemas.microsoft.com/office/word/2010/wordprocessingInk" xmlns:wne="http://schemas.microsoft.com/office/word/2006/wordml" xmlns:wps="http://schemas.microsoft.com/office/word/2010/wordprocessingShape"/>
+</file>
+
 <file path=word/endnotes.xml><?xml version="1.0" encoding="utf-8"?>
 <w:endnotes xmlns:wpc="http://schemas.microsoft.com/office/word/2010/wordprocessingCanvas" xmlns:mc="http://schemas.openxmlformats.org/markup-compatibility/2006" xmlns:o="urn:schemas-microsoft-com:office:office" xmlns:r="http://schemas.openxmlformats.org/officeDocument/2006/relationships" xmlns:m="http://schemas.openxmlformats.org/officeDocument/2006/math" xmlns:v="urn:schemas-microsoft-com:vml" xmlns:wp14="http://schemas.microsoft.com/office/word/2010/wordprocessingDrawing" xmlns:wp="http://schemas.openxmlformats.org/drawingml/2006/wordprocessingDrawing" xmlns:w10="urn:schemas-microsoft-com:office:word" xmlns:w="http://schemas.openxmlformats.org/wordprocessingml/2006/main" xmlns:w14="http://schemas.microsoft.com/office/word/2010/wordml" xmlns:w15="http://schemas.microsoft.com/office/word/2012/wordml" xmlns:wpg="http://schemas.microsoft.com/office/word/2010/wordprocessingGroup" xmlns:wpi="http://schemas.microsoft.com/office/word/2010/wordprocessingInk" xmlns:wne="http://schemas.microsoft.com/office/word/2006/wordml" xmlns:wps="http://schemas.microsoft.com/office/word/2010/wordprocessingShape" mc:Ignorable="w14 w15 wp14">
   <w:endnote w:type="separator" w:id="-1">
@@ -29349,7 +29353,7 @@
 <w:numbering xmlns:wpc="http://schemas.microsoft.com/office/word/2010/wordprocessingCanvas" xmlns:mc="http://schemas.openxmlformats.org/markup-compatibility/2006" xmlns:o="urn:schemas-microsoft-com:office:office" xmlns:r="http://schemas.openxmlformats.org/officeDocument/2006/relationships" xmlns:m="http://schemas.openxmlformats.org/officeDocument/2006/math" xmlns:v="urn:schemas-microsoft-com:vml" xmlns:wp14="http://schemas.microsoft.com/office/word/2010/wordprocessingDrawing" xmlns:wp="http://schemas.openxmlformats.org/drawingml/2006/wordprocessingDrawing" xmlns:w10="urn:schemas-microsoft-com:office:word" xmlns:w="http://schemas.openxmlformats.org/wordprocessingml/2006/main" xmlns:w14="http://schemas.microsoft.com/office/word/2010/wordml" xmlns:w15="http://schemas.microsoft.com/office/word/2012/wordml" xmlns:wpg="http://schemas.microsoft.com/office/word/2010/wordprocessingGroup" xmlns:wpi="http://schemas.microsoft.com/office/word/2010/wordprocessingInk" xmlns:wne="http://schemas.microsoft.com/office/word/2006/wordml" xmlns:wps="http://schemas.microsoft.com/office/word/2010/wordprocessingShape" mc:Ignorable="w14 w15 wp14">
   <w:abstractNum w:abstractNumId="1" w15:restartNumberingAfterBreak="0">
     <w:multiLevelType w:val="hybridMultilevel"/>
-    <w:lvl w:ilvl="0" w:tentative="1">
+    <w:lvl w:ilvl="0" w15:tentative="1">
       <w:start w:val="1"/>
       <w:numFmt w:val="bullet"/>
       <w:lvlText w:val="●"/>
@@ -29358,7 +29362,7 @@
         <w:ind w:left="720" w:hanging="360"/>
       </w:pPr>
     </w:lvl>
-    <w:lvl w:ilvl="1" w:tentative="1">
+    <w:lvl w:ilvl="1" w15:tentative="1">
       <w:start w:val="1"/>
       <w:numFmt w:val="bullet"/>
       <w:lvlText w:val="○"/>
@@ -29367,7 +29371,7 @@
         <w:ind w:left="1440" w:hanging="360"/>
       </w:pPr>
     </w:lvl>
-    <w:lvl w:ilvl="2" w:tentative="1">
+    <w:lvl w:ilvl="2" w15:tentative="1">
       <w:start w:val="1"/>
       <w:numFmt w:val="bullet"/>
       <w:lvlText w:val="■"/>
@@ -29376,7 +29380,7 @@
         <w:ind w:left="2160" w:hanging="360"/>
       </w:pPr>
     </w:lvl>
-    <w:lvl w:ilvl="3" w:tentative="1">
+    <w:lvl w:ilvl="3" w15:tentative="1">
       <w:start w:val="1"/>
       <w:numFmt w:val="bullet"/>
       <w:lvlText w:val="●"/>
@@ -29385,7 +29389,7 @@
         <w:ind w:left="2880" w:hanging="360"/>
       </w:pPr>
     </w:lvl>
-    <w:lvl w:ilvl="4" w:tentative="1">
+    <w:lvl w:ilvl="4" w15:tentative="1">
       <w:start w:val="1"/>
       <w:numFmt w:val="bullet"/>
       <w:lvlText w:val="○"/>
@@ -29394,7 +29398,7 @@
         <w:ind w:left="3600" w:hanging="360"/>
       </w:pPr>
     </w:lvl>
-    <w:lvl w:ilvl="5" w:tentative="1">
+    <w:lvl w:ilvl="5" w15:tentative="1">
       <w:start w:val="1"/>
       <w:numFmt w:val="bullet"/>
       <w:lvlText w:val="■"/>
@@ -29403,7 +29407,7 @@
         <w:ind w:left="4320" w:hanging="360"/>
       </w:pPr>
     </w:lvl>
-    <w:lvl w:ilvl="6" w:tentative="1">
+    <w:lvl w:ilvl="6" w15:tentative="1">
       <w:start w:val="1"/>
       <w:numFmt w:val="bullet"/>
       <w:lvlText w:val="●"/>
@@ -29412,7 +29416,7 @@
         <w:ind w:left="5040" w:hanging="360"/>
       </w:pPr>
     </w:lvl>
-    <w:lvl w:ilvl="7" w:tentative="1">
+    <w:lvl w:ilvl="7" w15:tentative="1">
       <w:start w:val="1"/>
       <w:numFmt w:val="bullet"/>
       <w:lvlText w:val="●"/>
@@ -29421,7 +29425,7 @@
         <w:ind w:left="5760" w:hanging="360"/>
       </w:pPr>
     </w:lvl>
-    <w:lvl w:ilvl="8" w:tentative="1">
+    <w:lvl w:ilvl="8" w15:tentative="1">
       <w:start w:val="1"/>
       <w:numFmt w:val="bullet"/>
       <w:lvlText w:val="●"/>
@@ -29453,25 +29457,6 @@
     </w:rPrDefault>
     <w:pPrDefault/>
   </w:docDefaults>
-  <w:style w:type="paragraph" w:styleId="Normal" w:default="1">
-    <w:name w:val="Normal"/>
-    <w:qFormat/>
-  </w:style>
-  <w:style w:type="table" w:styleId="TableNormal" w:default="true">
-    <w:name w:val="Normal Table"/>
-    <w:uiPriority w:val="99"/>
-    <w:semiHidden/>
-    <w:unhideWhenUsed/>
-    <w:tblPr>
-      <w:tblInd w:type="dxa" w:w="0"/>
-      <w:tblCellMar>
-        <w:top w:type="dxa" w:w="0"/>
-        <w:left w:type="dxa" w:w="108"/>
-        <w:bottom w:type="dxa" w:w="0"/>
-        <w:right w:type="dxa" w:w="108"/>
-      </w:tblCellMar>
-    </w:tblPr>
-  </w:style>
   <w:style w:type="paragraph" w:styleId="Title">
     <w:name w:val="Title"/>
     <w:basedOn w:val="Normal"/>
@@ -29480,6 +29465,39 @@
     <w:rPr>
       <w:sz w:val="56"/>
       <w:szCs w:val="56"/>
+    </w:rPr>
+  </w:style>
+  <w:style w:type="paragraph" w:styleId="Heading1">
+    <w:name w:val="Heading 1"/>
+    <w:basedOn w:val="Normal"/>
+    <w:next w:val="Normal"/>
+    <w:qFormat/>
+    <w:rPr>
+      <w:color w:val="2E74B5"/>
+      <w:sz w:val="32"/>
+      <w:szCs w:val="32"/>
+    </w:rPr>
+  </w:style>
+  <w:style w:type="paragraph" w:styleId="Heading2">
+    <w:name w:val="Heading 2"/>
+    <w:basedOn w:val="Normal"/>
+    <w:next w:val="Normal"/>
+    <w:qFormat/>
+    <w:rPr>
+      <w:color w:val="2E74B5"/>
+      <w:sz w:val="26"/>
+      <w:szCs w:val="26"/>
+    </w:rPr>
+  </w:style>
+  <w:style w:type="paragraph" w:styleId="Heading3">
+    <w:name w:val="Heading 3"/>
+    <w:basedOn w:val="Normal"/>
+    <w:next w:val="Normal"/>
+    <w:qFormat/>
+    <w:rPr>
+      <w:color w:val="1F4D78"/>
+      <w:sz w:val="24"/>
+      <w:szCs w:val="24"/>
     </w:rPr>
   </w:style>
   <w:style w:type="paragraph" w:styleId="Heading4">
@@ -29668,294 +29686,4 @@
     </w:rPr>
   </w:style>
 </w:styles>
-</file>
-
-<file path=word/theme/theme1.xml><?xml version="1.0" encoding="utf-8"?>
-<a:theme xmlns:a="http://schemas.openxmlformats.org/drawingml/2006/main" name="Office Theme">
-  <a:themeElements>
-    <a:clrScheme name="Office">
-      <a:dk1>
-        <a:sysClr val="windowText" lastClr="000000"/>
-      </a:dk1>
-      <a:lt1>
-        <a:sysClr val="window" lastClr="FFFFFF"/>
-      </a:lt1>
-      <a:dk2>
-        <a:srgbClr val="44546A"/>
-      </a:dk2>
-      <a:lt2>
-        <a:srgbClr val="E7E6E6"/>
-      </a:lt2>
-      <a:accent1>
-        <a:srgbClr val="4472C4"/>
-      </a:accent1>
-      <a:accent2>
-        <a:srgbClr val="ED7D31"/>
-      </a:accent2>
-      <a:accent3>
-        <a:srgbClr val="A5A5A5"/>
-      </a:accent3>
-      <a:accent4>
-        <a:srgbClr val="FFC000"/>
-      </a:accent4>
-      <a:accent5>
-        <a:srgbClr val="5B9BD5"/>
-      </a:accent5>
-      <a:accent6>
-        <a:srgbClr val="70AD47"/>
-      </a:accent6>
-      <a:hlink>
-        <a:srgbClr val="0563C1"/>
-      </a:hlink>
-      <a:folHlink>
-        <a:srgbClr val="954F72"/>
-      </a:folHlink>
-    </a:clrScheme>
-    <a:fontScheme name="Office">
-      <a:majorFont>
-        <a:latin typeface="Calibri Light" panose="020F0302020204030204"/>
-        <a:ea typeface=""/>
-        <a:cs typeface=""/>
-        <a:font script="Jpan" typeface="游ゴシック Light"/>
-        <a:font script="Hang" typeface="맑은 고딕"/>
-        <a:font script="Hans" typeface="等线 Light"/>
-        <a:font script="Hant" typeface="新細明體"/>
-        <a:font script="Arab" typeface="Times New Roman"/>
-        <a:font script="Hebr" typeface="Times New Roman"/>
-        <a:font script="Thai" typeface="Angsana New"/>
-        <a:font script="Ethi" typeface="Nyala"/>
-        <a:font script="Beng" typeface="Vrinda"/>
-        <a:font script="Gujr" typeface="Shruti"/>
-        <a:font script="Khmr" typeface="MoolBoran"/>
-        <a:font script="Knda" typeface="Tunga"/>
-        <a:font script="Guru" typeface="Raavi"/>
-        <a:font script="Cans" typeface="Euphemia"/>
-        <a:font script="Cher" typeface="Plantagenet Cherokee"/>
-        <a:font script="Yiii" typeface="Microsoft Yi Baiti"/>
-        <a:font script="Tibt" typeface="Microsoft Himalaya"/>
-        <a:font script="Thaa" typeface="MV Boli"/>
-        <a:font script="Deva" typeface="Mangal"/>
-        <a:font script="Telu" typeface="Gautami"/>
-        <a:font script="Taml" typeface="Latha"/>
-        <a:font script="Syrc" typeface="Estrangelo Edessa"/>
-        <a:font script="Orya" typeface="Kalinga"/>
-        <a:font script="Mlym" typeface="Kartika"/>
-        <a:font script="Laoo" typeface="DokChampa"/>
-        <a:font script="Sinh" typeface="Iskoola Pota"/>
-        <a:font script="Mong" typeface="Mongolian Baiti"/>
-        <a:font script="Viet" typeface="Times New Roman"/>
-        <a:font script="Uigh" typeface="Microsoft Uighur"/>
-        <a:font script="Geor" typeface="Sylfaen"/>
-        <a:font script="Armn" typeface="Arial"/>
-        <a:font script="Bugi" typeface="Leelawadee UI"/>
-        <a:font script="Bopo" typeface="Microsoft JhengHei"/>
-        <a:font script="Java" typeface="Javanese Text"/>
-        <a:font script="Lisu" typeface="Segoe UI"/>
-        <a:font script="Mymr" typeface="Myanmar Text"/>
-        <a:font script="Nkoo" typeface="Ebrima"/>
-        <a:font script="Olck" typeface="Nirmala UI"/>
-        <a:font script="Osma" typeface="Ebrima"/>
-        <a:font script="Phag" typeface="Phagspa"/>
-        <a:font script="Syrn" typeface="Estrangelo Edessa"/>
-        <a:font script="Syrj" typeface="Estrangelo Edessa"/>
-        <a:font script="Syre" typeface="Estrangelo Edessa"/>
-        <a:font script="Sora" typeface="Nirmala UI"/>
-        <a:font script="Tale" typeface="Microsoft Tai Le"/>
-        <a:font script="Talu" typeface="Microsoft New Tai Lue"/>
-        <a:font script="Tfng" typeface="Ebrima"/>
-      </a:majorFont>
-      <a:minorFont>
-        <a:latin typeface="Calibri" panose="020F0502020204030204"/>
-        <a:ea typeface=""/>
-        <a:cs typeface=""/>
-        <a:font script="Jpan" typeface="游明朝"/>
-        <a:font script="Hang" typeface="맑은 고딕"/>
-        <a:font script="Hans" typeface="等线"/>
-        <a:font script="Hant" typeface="新細明體"/>
-        <a:font script="Arab" typeface="Arial"/>
-        <a:font script="Hebr" typeface="Arial"/>
-        <a:font script="Thai" typeface="Cordia New"/>
-        <a:font script="Ethi" typeface="Nyala"/>
-        <a:font script="Beng" typeface="Vrinda"/>
-        <a:font script="Gujr" typeface="Shruti"/>
-        <a:font script="Khmr" typeface="DaunPenh"/>
-        <a:font script="Knda" typeface="Tunga"/>
-        <a:font script="Guru" typeface="Raavi"/>
-        <a:font script="Cans" typeface="Euphemia"/>
-        <a:font script="Cher" typeface="Plantagenet Cherokee"/>
-        <a:font script="Yiii" typeface="Microsoft Yi Baiti"/>
-        <a:font script="Tibt" typeface="Microsoft Himalaya"/>
-        <a:font script="Thaa" typeface="MV Boli"/>
-        <a:font script="Deva" typeface="Mangal"/>
-        <a:font script="Telu" typeface="Gautami"/>
-        <a:font script="Taml" typeface="Latha"/>
-        <a:font script="Syrc" typeface="Estrangelo Edessa"/>
-        <a:font script="Orya" typeface="Kalinga"/>
-        <a:font script="Mlym" typeface="Kartika"/>
-        <a:font script="Laoo" typeface="DokChampa"/>
-        <a:font script="Sinh" typeface="Iskoola Pota"/>
-        <a:font script="Mong" typeface="Mongolian Baiti"/>
-        <a:font script="Viet" typeface="Arial"/>
-        <a:font script="Uigh" typeface="Microsoft Uighur"/>
-        <a:font script="Geor" typeface="Sylfaen"/>
-        <a:font script="Armn" typeface="Arial"/>
-        <a:font script="Bugi" typeface="Leelawadee UI"/>
-        <a:font script="Bopo" typeface="Microsoft JhengHei"/>
-        <a:font script="Java" typeface="Javanese Text"/>
-        <a:font script="Lisu" typeface="Segoe UI"/>
-        <a:font script="Mymr" typeface="Myanmar Text"/>
-        <a:font script="Nkoo" typeface="Ebrima"/>
-        <a:font script="Olck" typeface="Nirmala UI"/>
-        <a:font script="Osma" typeface="Ebrima"/>
-        <a:font script="Phag" typeface="Phagspa"/>
-        <a:font script="Syrn" typeface="Estrangelo Edessa"/>
-        <a:font script="Syrj" typeface="Estrangelo Edessa"/>
-        <a:font script="Syre" typeface="Estrangelo Edessa"/>
-        <a:font script="Sora" typeface="Nirmala UI"/>
-        <a:font script="Tale" typeface="Microsoft Tai Le"/>
-        <a:font script="Talu" typeface="Microsoft New Tai Lue"/>
-        <a:font script="Tfng" typeface="Ebrima"/>
-      </a:minorFont>
-    </a:fontScheme>
-    <a:fmtScheme name="Office">
-      <a:fillStyleLst>
-        <a:solidFill>
-          <a:schemeClr val="phClr"/>
-        </a:solidFill>
-        <a:gradFill rotWithShape="true">
-          <a:gsLst>
-            <a:gs pos="0">
-              <a:schemeClr val="phClr">
-                <a:lumMod val="110000"/>
-                <a:satMod val="105000"/>
-                <a:tint val="67000"/>
-              </a:schemeClr>
-            </a:gs>
-            <a:gs pos="50000">
-              <a:schemeClr val="phClr">
-                <a:lumMod val="105000"/>
-                <a:satMod val="103000"/>
-                <a:tint val="73000"/>
-              </a:schemeClr>
-            </a:gs>
-            <a:gs pos="100000">
-              <a:schemeClr val="phClr">
-                <a:lumMod val="105000"/>
-                <a:satMod val="109000"/>
-                <a:tint val="81000"/>
-              </a:schemeClr>
-            </a:gs>
-          </a:gsLst>
-          <a:lin ang="5400000" scaled="false"/>
-        </a:gradFill>
-        <a:gradFill rotWithShape="true">
-          <a:gsLst>
-            <a:gs pos="0">
-              <a:schemeClr val="phClr">
-                <a:satMod val="103000"/>
-                <a:lumMod val="102000"/>
-                <a:tint val="94000"/>
-              </a:schemeClr>
-            </a:gs>
-            <a:gs pos="50000">
-              <a:schemeClr val="phClr">
-                <a:satMod val="110000"/>
-                <a:lumMod val="100000"/>
-                <a:shade val="100000"/>
-              </a:schemeClr>
-            </a:gs>
-            <a:gs pos="100000">
-              <a:schemeClr val="phClr">
-                <a:lumMod val="99000"/>
-                <a:satMod val="120000"/>
-                <a:shade val="78000"/>
-              </a:schemeClr>
-            </a:gs>
-          </a:gsLst>
-          <a:lin ang="5400000" scaled="false"/>
-        </a:gradFill>
-      </a:fillStyleLst>
-      <a:lnStyleLst>
-        <a:ln w="6350" cap="flat" cmpd="sng" algn="ctr">
-          <a:solidFill>
-            <a:schemeClr val="phClr"/>
-          </a:solidFill>
-          <a:prstDash val="solid"/>
-          <a:miter lim="800000"/>
-        </a:ln>
-        <a:ln w="12700" cap="flat" cmpd="sng" algn="ctr">
-          <a:solidFill>
-            <a:schemeClr val="phClr"/>
-          </a:solidFill>
-          <a:prstDash val="solid"/>
-          <a:miter lim="800000"/>
-        </a:ln>
-        <a:ln w="19050" cap="flat" cmpd="sng" algn="ctr">
-          <a:solidFill>
-            <a:schemeClr val="phClr"/>
-          </a:solidFill>
-          <a:prstDash val="solid"/>
-          <a:miter lim="800000"/>
-        </a:ln>
-      </a:lnStyleLst>
-      <a:effectStyleLst>
-        <a:effectStyle>
-          <a:effectLst/>
-        </a:effectStyle>
-        <a:effectStyle>
-          <a:effectLst/>
-        </a:effectStyle>
-        <a:effectStyle>
-          <a:effectLst>
-            <a:outerShdw blurRad="57150" dist="19050" dir="5400000" algn="ctr" rotWithShape="false">
-              <a:srgbClr val="000000">
-                <a:alpha val="63000"/>
-              </a:srgbClr>
-            </a:outerShdw>
-          </a:effectLst>
-        </a:effectStyle>
-      </a:effectStyleLst>
-      <a:bgFillStyleLst>
-        <a:solidFill>
-          <a:schemeClr val="phClr"/>
-        </a:solidFill>
-        <a:solidFill>
-          <a:schemeClr val="phClr">
-            <a:tint val="95000"/>
-            <a:satMod val="170000"/>
-          </a:schemeClr>
-        </a:solidFill>
-        <a:gradFill rotWithShape="true">
-          <a:gsLst>
-            <a:gs pos="0">
-              <a:schemeClr val="phClr">
-                <a:tint val="93000"/>
-                <a:satMod val="150000"/>
-                <a:shade val="98000"/>
-                <a:lumMod val="102000"/>
-              </a:schemeClr>
-            </a:gs>
-            <a:gs pos="50000">
-              <a:schemeClr val="phClr">
-                <a:tint val="98000"/>
-                <a:satMod val="130000"/>
-                <a:shade val="90000"/>
-                <a:lumMod val="103000"/>
-              </a:schemeClr>
-            </a:gs>
-            <a:gs pos="100000">
-              <a:schemeClr val="phClr">
-                <a:shade val="63000"/>
-                <a:satMod val="120000"/>
-              </a:schemeClr>
-            </a:gs>
-          </a:gsLst>
-          <a:lin ang="5400000" scaled="false"/>
-        </a:gradFill>
-      </a:bgFillStyleLst>
-    </a:fmtScheme>
-  </a:themeElements>
-  <a:objectDefaults/>
-  <a:extraClrSchemeLst/>
-</a:theme>
 </file>
</xml_diff>